<commit_message>
modif to empty BUa to make the render cleaner
</commit_message>
<xml_diff>
--- a/modules/biosafety/resources/empty_BUA.docx
+++ b/modules/biosafety/resources/empty_BUA.docx
@@ -1496,22 +1496,27 @@
         </w:tc>
       </w:tr>
       <w:tr>
+        <w:trPr>
+          <w:trHeight w:val="133"/>
+        </w:trPr>
         <w:tc>
           <w:tcPr>
             <w:tcW w:w="3420" w:type="dxa"/>
             <w:gridSpan w:val="3"/>
           </w:tcPr>
           <w:p>
-            <w:r>
-              <w:t xml:space="preserve">{% tr for p in personnel %} </w:t>
-            </w:r>
-            <w:proofErr w:type="gramStart"/>
-            <w:r>
-              <w:t>{{ p</w:t>
-            </w:r>
-            <w:proofErr w:type="gramEnd"/>
-            <w:r>
-              <w:t>.name }}</w:t>
+            <w:pPr>
+              <w:rPr>
+                <w:sz w:val="20"/>
+                <w:szCs w:val="20"/>
+              </w:rPr>
+            </w:pPr>
+            <w:r>
+              <w:rPr>
+                <w:sz w:val="20"/>
+                <w:szCs w:val="20"/>
+              </w:rPr>
+              <w:t>{% for p in personnel %}</w:t>
             </w:r>
           </w:p>
         </w:tc>
@@ -1529,12 +1534,6 @@
                 <w:noProof/>
               </w:rPr>
             </w:pPr>
-            <w:r>
-              <w:rPr>
-                <w:noProof/>
-              </w:rPr>
-              <w:t>{{ p.phone }}</w:t>
-            </w:r>
           </w:p>
         </w:tc>
         <w:tc>
@@ -1552,12 +1551,6 @@
                 <w:noProof/>
               </w:rPr>
             </w:pPr>
-            <w:r>
-              <w:rPr>
-                <w:noProof/>
-              </w:rPr>
-              <w:t>{{ p.biosafety_training }}</w:t>
-            </w:r>
           </w:p>
         </w:tc>
         <w:tc>
@@ -1572,12 +1565,6 @@
                 <w:noProof/>
               </w:rPr>
             </w:pPr>
-            <w:r>
-              <w:rPr>
-                <w:noProof/>
-              </w:rPr>
-              <w:t>{{ p.bloodborne_pathogens_training }}</w:t>
-            </w:r>
           </w:p>
         </w:tc>
         <w:tc>
@@ -1592,11 +1579,108 @@
                 <w:noProof/>
               </w:rPr>
             </w:pPr>
-            <w:r>
+          </w:p>
+        </w:tc>
+      </w:tr>
+      <w:tr>
+        <w:tc>
+          <w:tcPr>
+            <w:tcW w:w="3420" w:type="dxa"/>
+            <w:gridSpan w:val="3"/>
+          </w:tcPr>
+          <w:p>
+            <w:proofErr w:type="gramStart"/>
+            <w:r>
+              <w:t>{{ p</w:t>
+            </w:r>
+            <w:proofErr w:type="gramEnd"/>
+            <w:r>
+              <w:t>.name }}</w:t>
+            </w:r>
+          </w:p>
+        </w:tc>
+        <w:tc>
+          <w:tcPr>
+            <w:tcW w:w="2160" w:type="dxa"/>
+            <w:gridSpan w:val="4"/>
+            <w:tcBorders>
+              <w:right w:val="single" w:sz="18" w:space="0" w:color="auto"/>
+            </w:tcBorders>
+          </w:tcPr>
+          <w:p>
+            <w:pPr>
               <w:rPr>
                 <w:noProof/>
               </w:rPr>
-              <w:t>{{ p.medical_waste_training }}{% tr endfor %}</w:t>
+            </w:pPr>
+            <w:r>
+              <w:rPr>
+                <w:noProof/>
+              </w:rPr>
+              <w:t>{{ p.phone }}</w:t>
+            </w:r>
+          </w:p>
+        </w:tc>
+        <w:tc>
+          <w:tcPr>
+            <w:tcW w:w="1260" w:type="dxa"/>
+            <w:gridSpan w:val="2"/>
+            <w:tcBorders>
+              <w:left w:val="single" w:sz="18" w:space="0" w:color="auto"/>
+            </w:tcBorders>
+          </w:tcPr>
+          <w:p>
+            <w:pPr>
+              <w:jc w:val="center"/>
+              <w:rPr>
+                <w:noProof/>
+              </w:rPr>
+            </w:pPr>
+            <w:r>
+              <w:rPr>
+                <w:noProof/>
+              </w:rPr>
+              <w:t>{% if p.biosafety_training %} Yes {% else %} No {% endif %}</w:t>
+            </w:r>
+          </w:p>
+        </w:tc>
+        <w:tc>
+          <w:tcPr>
+            <w:tcW w:w="1440" w:type="dxa"/>
+            <w:gridSpan w:val="3"/>
+          </w:tcPr>
+          <w:p>
+            <w:pPr>
+              <w:jc w:val="center"/>
+              <w:rPr>
+                <w:noProof/>
+              </w:rPr>
+            </w:pPr>
+            <w:r>
+              <w:rPr>
+                <w:noProof/>
+              </w:rPr>
+              <w:t>{% if p.bloodborne_pathogens_training %} Yes {% else %} No {% endif %}</w:t>
+            </w:r>
+          </w:p>
+        </w:tc>
+        <w:tc>
+          <w:tcPr>
+            <w:tcW w:w="1260" w:type="dxa"/>
+            <w:gridSpan w:val="2"/>
+          </w:tcPr>
+          <w:p>
+            <w:pPr>
+              <w:jc w:val="center"/>
+              <w:rPr>
+                <w:noProof/>
+              </w:rPr>
+            </w:pPr>
+            <w:r>
+              <w:rPr>
+                <w:noProof/>
+              </w:rPr>
+              <w:t>{% if p.medical_waste_training %} Yes {% else %} No {% endif %}</w:t>
             </w:r>
           </w:p>
         </w:tc>
@@ -1610,7 +1694,15 @@
             <w:tcW w:w="3420" w:type="dxa"/>
             <w:gridSpan w:val="3"/>
           </w:tcPr>
-          <w:p/>
+          <w:p>
+            <w:r>
+              <w:rPr>
+                <w:noProof/>
+              </w:rPr>
+              <w:lastRenderedPageBreak/>
+              <w:t>{% endfor %}</w:t>
+            </w:r>
+          </w:p>
         </w:tc>
         <w:tc>
           <w:tcPr>
@@ -1651,75 +1743,6 @@
           <w:tcPr>
             <w:tcW w:w="1260" w:type="dxa"/>
             <w:gridSpan w:val="2"/>
-          </w:tcPr>
-          <w:p>
-            <w:pPr>
-              <w:jc w:val="center"/>
-            </w:pPr>
-          </w:p>
-        </w:tc>
-      </w:tr>
-      <w:tr>
-        <w:trPr>
-          <w:trHeight w:val="70"/>
-        </w:trPr>
-        <w:tc>
-          <w:tcPr>
-            <w:tcW w:w="3420" w:type="dxa"/>
-            <w:gridSpan w:val="3"/>
-            <w:tcBorders>
-              <w:bottom w:val="single" w:sz="8" w:space="0" w:color="auto"/>
-            </w:tcBorders>
-          </w:tcPr>
-          <w:p/>
-        </w:tc>
-        <w:tc>
-          <w:tcPr>
-            <w:tcW w:w="2160" w:type="dxa"/>
-            <w:gridSpan w:val="4"/>
-            <w:tcBorders>
-              <w:bottom w:val="single" w:sz="8" w:space="0" w:color="auto"/>
-              <w:right w:val="single" w:sz="18" w:space="0" w:color="auto"/>
-            </w:tcBorders>
-          </w:tcPr>
-          <w:p/>
-        </w:tc>
-        <w:tc>
-          <w:tcPr>
-            <w:tcW w:w="1260" w:type="dxa"/>
-            <w:gridSpan w:val="2"/>
-            <w:tcBorders>
-              <w:left w:val="single" w:sz="18" w:space="0" w:color="auto"/>
-              <w:bottom w:val="single" w:sz="8" w:space="0" w:color="auto"/>
-            </w:tcBorders>
-          </w:tcPr>
-          <w:p>
-            <w:pPr>
-              <w:jc w:val="center"/>
-            </w:pPr>
-          </w:p>
-        </w:tc>
-        <w:tc>
-          <w:tcPr>
-            <w:tcW w:w="1440" w:type="dxa"/>
-            <w:gridSpan w:val="3"/>
-            <w:tcBorders>
-              <w:bottom w:val="single" w:sz="8" w:space="0" w:color="auto"/>
-            </w:tcBorders>
-          </w:tcPr>
-          <w:p>
-            <w:pPr>
-              <w:jc w:val="center"/>
-            </w:pPr>
-          </w:p>
-        </w:tc>
-        <w:tc>
-          <w:tcPr>
-            <w:tcW w:w="1260" w:type="dxa"/>
-            <w:gridSpan w:val="2"/>
-            <w:tcBorders>
-              <w:bottom w:val="single" w:sz="8" w:space="0" w:color="auto"/>
-            </w:tcBorders>
           </w:tcPr>
           <w:p>
             <w:pPr>
@@ -1780,7 +1803,6 @@
               <w:rPr>
                 <w:b/>
               </w:rPr>
-              <w:lastRenderedPageBreak/>
               <w:t>Authorized Lab Locations</w:t>
             </w:r>
             <w:r>
@@ -2155,7 +2177,7 @@
               <w:rPr>
                 <w:noProof/>
               </w:rPr>
-              <w:t>{% tr for r in room_usage %} {{ r.building }}</w:t>
+              <w:t>{% for r in room_usage %}</w:t>
             </w:r>
           </w:p>
         </w:tc>
@@ -2169,12 +2191,6 @@
                 <w:noProof/>
               </w:rPr>
             </w:pPr>
-            <w:r>
-              <w:rPr>
-                <w:noProof/>
-              </w:rPr>
-              <w:t>{{ r.room_number }}</w:t>
-            </w:r>
           </w:p>
         </w:tc>
         <w:tc>
@@ -2188,30 +2204,18 @@
                 <w:noProof/>
               </w:rPr>
             </w:pPr>
-            <w:r>
+          </w:p>
+        </w:tc>
+        <w:tc>
+          <w:tcPr>
+            <w:tcW w:w="900" w:type="dxa"/>
+          </w:tcPr>
+          <w:p>
+            <w:pPr>
               <w:rPr>
                 <w:noProof/>
               </w:rPr>
-              <w:t>{{ r.shared_room }}</w:t>
-            </w:r>
-          </w:p>
-        </w:tc>
-        <w:tc>
-          <w:tcPr>
-            <w:tcW w:w="900" w:type="dxa"/>
-          </w:tcPr>
-          <w:p>
-            <w:pPr>
-              <w:rPr>
-                <w:noProof/>
-              </w:rPr>
             </w:pPr>
-            <w:r>
-              <w:rPr>
-                <w:noProof/>
-              </w:rPr>
-              <w:t>{{ r.biosafety_level }}</w:t>
-            </w:r>
           </w:p>
         </w:tc>
         <w:tc>
@@ -2225,12 +2229,6 @@
                 <w:noProof/>
               </w:rPr>
             </w:pPr>
-            <w:r>
-              <w:rPr>
-                <w:noProof/>
-              </w:rPr>
-              <w:t>{{ r.storage }}</w:t>
-            </w:r>
           </w:p>
         </w:tc>
         <w:tc>
@@ -2245,12 +2243,6 @@
                 <w:noProof/>
               </w:rPr>
             </w:pPr>
-            <w:r>
-              <w:rPr>
-                <w:noProof/>
-              </w:rPr>
-              <w:t>{{ r.research }}</w:t>
-            </w:r>
           </w:p>
         </w:tc>
         <w:tc>
@@ -2265,12 +2257,6 @@
                 <w:noProof/>
               </w:rPr>
             </w:pPr>
-            <w:r>
-              <w:rPr>
-                <w:noProof/>
-              </w:rPr>
-              <w:t>{{ r.biosafety_cabinet }}</w:t>
-            </w:r>
           </w:p>
         </w:tc>
         <w:tc>
@@ -2284,12 +2270,6 @@
                 <w:noProof/>
               </w:rPr>
             </w:pPr>
-            <w:r>
-              <w:rPr>
-                <w:noProof/>
-              </w:rPr>
-              <w:t>{{ r.autoclave }}</w:t>
-            </w:r>
           </w:p>
         </w:tc>
         <w:tc>
@@ -2304,12 +2284,6 @@
                 <w:noProof/>
               </w:rPr>
             </w:pPr>
-            <w:r>
-              <w:rPr>
-                <w:noProof/>
-              </w:rPr>
-              <w:t>{{ r.medical_waste }}</w:t>
-            </w:r>
           </w:p>
         </w:tc>
         <w:tc>
@@ -2323,12 +2297,6 @@
                 <w:noProof/>
               </w:rPr>
             </w:pPr>
-            <w:r>
-              <w:rPr>
-                <w:noProof/>
-              </w:rPr>
-              <w:t>{{ r.animal }} {% tr endfor %}</w:t>
-            </w:r>
           </w:p>
         </w:tc>
       </w:tr>
@@ -2337,26 +2305,74 @@
           <w:tcPr>
             <w:tcW w:w="1800" w:type="dxa"/>
           </w:tcPr>
-          <w:p/>
+          <w:p>
+            <w:pPr>
+              <w:rPr>
+                <w:noProof/>
+              </w:rPr>
+            </w:pPr>
+            <w:r>
+              <w:rPr>
+                <w:noProof/>
+              </w:rPr>
+              <w:t>{{ r.building }}</w:t>
+            </w:r>
+          </w:p>
         </w:tc>
         <w:tc>
           <w:tcPr>
             <w:tcW w:w="900" w:type="dxa"/>
           </w:tcPr>
-          <w:p/>
+          <w:p>
+            <w:pPr>
+              <w:rPr>
+                <w:noProof/>
+              </w:rPr>
+            </w:pPr>
+            <w:r>
+              <w:rPr>
+                <w:noProof/>
+              </w:rPr>
+              <w:t>{{ r.room_number }}</w:t>
+            </w:r>
+          </w:p>
         </w:tc>
         <w:tc>
           <w:tcPr>
             <w:tcW w:w="900" w:type="dxa"/>
             <w:gridSpan w:val="2"/>
           </w:tcPr>
-          <w:p/>
+          <w:p>
+            <w:pPr>
+              <w:rPr>
+                <w:noProof/>
+              </w:rPr>
+            </w:pPr>
+            <w:r>
+              <w:rPr>
+                <w:noProof/>
+              </w:rPr>
+              <w:t>{{ r.shared_room }}</w:t>
+            </w:r>
+          </w:p>
         </w:tc>
         <w:tc>
           <w:tcPr>
             <w:tcW w:w="900" w:type="dxa"/>
           </w:tcPr>
-          <w:p/>
+          <w:p>
+            <w:pPr>
+              <w:rPr>
+                <w:noProof/>
+              </w:rPr>
+            </w:pPr>
+            <w:r>
+              <w:rPr>
+                <w:noProof/>
+              </w:rPr>
+              <w:t>{{ r.biosafety_level }}</w:t>
+            </w:r>
+          </w:p>
         </w:tc>
         <w:tc>
           <w:tcPr>
@@ -2365,7 +2381,16 @@
           <w:p>
             <w:pPr>
               <w:jc w:val="center"/>
+              <w:rPr>
+                <w:noProof/>
+              </w:rPr>
             </w:pPr>
+            <w:r>
+              <w:rPr>
+                <w:noProof/>
+              </w:rPr>
+              <w:t>{% if r.storage %} Yes {% else %} No {% endif %}</w:t>
+            </w:r>
           </w:p>
         </w:tc>
         <w:tc>
@@ -2376,7 +2401,16 @@
           <w:p>
             <w:pPr>
               <w:jc w:val="center"/>
+              <w:rPr>
+                <w:noProof/>
+              </w:rPr>
             </w:pPr>
+            <w:r>
+              <w:rPr>
+                <w:noProof/>
+              </w:rPr>
+              <w:t>{% if r.research %} Yes {% else %} No {% endif %}</w:t>
+            </w:r>
           </w:p>
         </w:tc>
         <w:tc>
@@ -2387,7 +2421,16 @@
           <w:p>
             <w:pPr>
               <w:jc w:val="center"/>
+              <w:rPr>
+                <w:noProof/>
+              </w:rPr>
             </w:pPr>
+            <w:r>
+              <w:rPr>
+                <w:noProof/>
+              </w:rPr>
+              <w:t>{% if r.biosafety_cabinet %} Yes {% else %} No {% endif %}</w:t>
+            </w:r>
           </w:p>
         </w:tc>
         <w:tc>
@@ -2397,7 +2440,16 @@
           <w:p>
             <w:pPr>
               <w:jc w:val="center"/>
+              <w:rPr>
+                <w:noProof/>
+              </w:rPr>
             </w:pPr>
+            <w:r>
+              <w:rPr>
+                <w:noProof/>
+              </w:rPr>
+              <w:t>{% if r.autoclave %} Yes {% else %} No {% endif %}</w:t>
+            </w:r>
           </w:p>
         </w:tc>
         <w:tc>
@@ -2408,7 +2460,16 @@
           <w:p>
             <w:pPr>
               <w:jc w:val="center"/>
+              <w:rPr>
+                <w:noProof/>
+              </w:rPr>
             </w:pPr>
+            <w:r>
+              <w:rPr>
+                <w:noProof/>
+              </w:rPr>
+              <w:t>{% if r.medical_waste %} Yes {% else %} No {% endif %}</w:t>
+            </w:r>
           </w:p>
         </w:tc>
         <w:tc>
@@ -2418,7 +2479,16 @@
           <w:p>
             <w:pPr>
               <w:jc w:val="center"/>
+              <w:rPr>
+                <w:noProof/>
+              </w:rPr>
             </w:pPr>
+            <w:r>
+              <w:rPr>
+                <w:noProof/>
+              </w:rPr>
+              <w:t>{% if r.animal %} Yes {% else %} No {% endif %}</w:t>
+            </w:r>
           </w:p>
         </w:tc>
       </w:tr>
@@ -2427,7 +2497,14 @@
           <w:tcPr>
             <w:tcW w:w="1800" w:type="dxa"/>
           </w:tcPr>
-          <w:p/>
+          <w:p>
+            <w:r>
+              <w:rPr>
+                <w:noProof/>
+              </w:rPr>
+              <w:t>{% endfor %}</w:t>
+            </w:r>
+          </w:p>
         </w:tc>
         <w:tc>
           <w:tcPr>
@@ -11343,7 +11420,6 @@
   <w:style w:type="character" w:default="1" w:styleId="DefaultParagraphFont">
     <w:name w:val="Default Paragraph Font"/>
     <w:uiPriority w:val="1"/>
-    <w:semiHidden/>
     <w:unhideWhenUsed/>
   </w:style>
   <w:style w:type="table" w:default="1" w:styleId="TableNormal">

</xml_diff>

<commit_message>
Changed bua_analysis to include absa info
</commit_message>
<xml_diff>
--- a/modules/biosafety/resources/empty_BUA.docx
+++ b/modules/biosafety/resources/empty_BUA.docx
@@ -3884,7 +3884,6 @@
               <w:ind w:left="360"/>
             </w:pPr>
             <w:r>
-              <w:lastRenderedPageBreak/>
               <w:t xml:space="preserve">D. Other:  </w:t>
             </w:r>
           </w:p>
@@ -4069,8 +4068,8 @@
               </w:rPr>
               <w:t xml:space="preserve">be obtained from a source outside of </w:t>
             </w:r>
-            <w:smartTag w:uri="urn:schemas-microsoft-com:office:smarttags" w:element="place">
-              <w:smartTag w:uri="urn:schemas-microsoft-com:office:smarttags" w:element="State">
+            <w:smartTag w:uri="urn:schemas-microsoft-com:office:smarttags" w:element="State">
+              <w:smartTag w:uri="urn:schemas-microsoft-com:office:smarttags" w:element="place">
                 <w:r>
                   <w:rPr>
                     <w:b/>
@@ -11420,6 +11419,7 @@
   <w:style w:type="character" w:default="1" w:styleId="DefaultParagraphFont">
     <w:name w:val="Default Paragraph Font"/>
     <w:uiPriority w:val="1"/>
+    <w:semiHidden/>
     <w:unhideWhenUsed/>
   </w:style>
   <w:style w:type="table" w:default="1" w:styleId="TableNormal">
@@ -11867,15 +11867,16 @@
 </file>
 
 <file path=customXml/item1.xml><?xml version="1.0" encoding="utf-8"?>
-<?mso-contentType ?>
-<FormTemplates xmlns="http://schemas.microsoft.com/sharepoint/v3/contenttype/forms">
-  <Display>DocumentLibraryForm</Display>
-  <Edit>DocumentLibraryForm</Edit>
-  <New>DocumentLibraryForm</New>
-</FormTemplates>
+<b:Sources xmlns:b="http://schemas.openxmlformats.org/officeDocument/2006/bibliography" xmlns="http://schemas.openxmlformats.org/officeDocument/2006/bibliography" SelectedStyle="\APASixthEditionOfficeOnline.xsl" StyleName="APA" Version="6"/>
 </file>
 
 <file path=customXml/item2.xml><?xml version="1.0" encoding="utf-8"?>
+<p:properties xmlns:p="http://schemas.microsoft.com/office/2006/metadata/properties" xmlns:xsi="http://www.w3.org/2001/XMLSchema-instance" xmlns:pc="http://schemas.microsoft.com/office/infopath/2007/PartnerControls">
+  <documentManagement/>
+</p:properties>
+</file>
+
+<file path=customXml/item3.xml><?xml version="1.0" encoding="utf-8"?>
 <ct:contentTypeSchema xmlns:ct="http://schemas.microsoft.com/office/2006/metadata/contentType" xmlns:ma="http://schemas.microsoft.com/office/2006/metadata/properties/metaAttributes" ct:_="" ma:_="" ma:contentTypeName="Document" ma:contentTypeID="0x010100C728819C1159944AA4DD464ECAD54CA1" ma:contentTypeVersion="0" ma:contentTypeDescription="Create a new document." ma:contentTypeScope="" ma:versionID="fd36e4993f9cced9c0d6cdf531d3eb7c">
   <xsd:schema xmlns:xsd="http://www.w3.org/2001/XMLSchema" xmlns:xs="http://www.w3.org/2001/XMLSchema" xmlns:p="http://schemas.microsoft.com/office/2006/metadata/properties" targetNamespace="http://schemas.microsoft.com/office/2006/metadata/properties" ma:root="true" ma:fieldsID="c64490b4aec6201516c3a874156f37b2">
     <xsd:element name="properties">
@@ -11989,25 +11990,33 @@
 </ct:contentTypeSchema>
 </file>
 
-<file path=customXml/item3.xml><?xml version="1.0" encoding="utf-8"?>
-<p:properties xmlns:p="http://schemas.microsoft.com/office/2006/metadata/properties" xmlns:xsi="http://www.w3.org/2001/XMLSchema-instance" xmlns:pc="http://schemas.microsoft.com/office/infopath/2007/PartnerControls">
-  <documentManagement/>
-</p:properties>
-</file>
-
 <file path=customXml/item4.xml><?xml version="1.0" encoding="utf-8"?>
-<b:Sources xmlns:b="http://schemas.openxmlformats.org/officeDocument/2006/bibliography" xmlns="http://schemas.openxmlformats.org/officeDocument/2006/bibliography" SelectedStyle="\APASixthEditionOfficeOnline.xsl" StyleName="APA" Version="6"/>
+<?mso-contentType ?>
+<FormTemplates xmlns="http://schemas.microsoft.com/sharepoint/v3/contenttype/forms">
+  <Display>DocumentLibraryForm</Display>
+  <Edit>DocumentLibraryForm</Edit>
+  <New>DocumentLibraryForm</New>
+</FormTemplates>
 </file>
 
 <file path=customXml/itemProps1.xml><?xml version="1.0" encoding="utf-8"?>
-<ds:datastoreItem xmlns:ds="http://schemas.openxmlformats.org/officeDocument/2006/customXml" ds:itemID="{4C018133-1394-4FDE-8D7B-59EBEA428F5B}">
+<ds:datastoreItem xmlns:ds="http://schemas.openxmlformats.org/officeDocument/2006/customXml" ds:itemID="{3FB07152-C848-4F83-AA20-0B36A1606AD0}">
   <ds:schemaRefs>
-    <ds:schemaRef ds:uri="http://schemas.microsoft.com/sharepoint/v3/contenttype/forms"/>
+    <ds:schemaRef ds:uri="http://schemas.openxmlformats.org/officeDocument/2006/bibliography"/>
   </ds:schemaRefs>
 </ds:datastoreItem>
 </file>
 
 <file path=customXml/itemProps2.xml><?xml version="1.0" encoding="utf-8"?>
+<ds:datastoreItem xmlns:ds="http://schemas.openxmlformats.org/officeDocument/2006/customXml" ds:itemID="{09BD9572-7667-401D-A751-68330DF4A5F1}">
+  <ds:schemaRefs>
+    <ds:schemaRef ds:uri="http://schemas.microsoft.com/office/2006/metadata/properties"/>
+    <ds:schemaRef ds:uri="http://schemas.microsoft.com/office/infopath/2007/PartnerControls"/>
+  </ds:schemaRefs>
+</ds:datastoreItem>
+</file>
+
+<file path=customXml/itemProps3.xml><?xml version="1.0" encoding="utf-8"?>
 <ds:datastoreItem xmlns:ds="http://schemas.openxmlformats.org/officeDocument/2006/customXml" ds:itemID="{784996D7-6538-4C76-BA48-BA33338EED33}">
   <ds:schemaRefs>
     <ds:schemaRef ds:uri="http://schemas.microsoft.com/office/2006/metadata/contentType"/>
@@ -12023,19 +12032,10 @@
 </ds:datastoreItem>
 </file>
 
-<file path=customXml/itemProps3.xml><?xml version="1.0" encoding="utf-8"?>
-<ds:datastoreItem xmlns:ds="http://schemas.openxmlformats.org/officeDocument/2006/customXml" ds:itemID="{09BD9572-7667-401D-A751-68330DF4A5F1}">
+<file path=customXml/itemProps4.xml><?xml version="1.0" encoding="utf-8"?>
+<ds:datastoreItem xmlns:ds="http://schemas.openxmlformats.org/officeDocument/2006/customXml" ds:itemID="{4C018133-1394-4FDE-8D7B-59EBEA428F5B}">
   <ds:schemaRefs>
-    <ds:schemaRef ds:uri="http://schemas.microsoft.com/office/2006/metadata/properties"/>
-    <ds:schemaRef ds:uri="http://schemas.microsoft.com/office/infopath/2007/PartnerControls"/>
-  </ds:schemaRefs>
-</ds:datastoreItem>
-</file>
-
-<file path=customXml/itemProps4.xml><?xml version="1.0" encoding="utf-8"?>
-<ds:datastoreItem xmlns:ds="http://schemas.openxmlformats.org/officeDocument/2006/customXml" ds:itemID="{3FB07152-C848-4F83-AA20-0B36A1606AD0}">
-  <ds:schemaRefs>
-    <ds:schemaRef ds:uri="http://schemas.openxmlformats.org/officeDocument/2006/bibliography"/>
+    <ds:schemaRef ds:uri="http://schemas.microsoft.com/sharepoint/v3/contenttype/forms"/>
   </ds:schemaRefs>
 </ds:datastoreItem>
 </file>
</xml_diff>